<commit_message>
fix: regenerate CV with LibreOffice-compatible borderless tables
Co-Authored-By: Claude Opus 4.6 (1M context) <noreply@anthropic.com>
</commit_message>
<xml_diff>
--- a/Robert_Treacy_CV.docx
+++ b/Robert_Treacy_CV.docx
@@ -95,12 +95,12 @@
         <w:tblLayout w:type="autofit"/>
         <w:tblLook w:firstColumn="1" w:firstRow="1" w:lastColumn="0" w:lastRow="0" w:noHBand="0" w:noVBand="1" w:val="04A0"/>
         <w:tblBorders>
-          <w:top w:val="nil"/>
-          <w:left w:val="nil"/>
-          <w:bottom w:val="nil"/>
-          <w:right w:val="nil"/>
-          <w:insideH w:val="nil"/>
-          <w:insideV w:val="nil"/>
+          <w:top w:val="none" w:sz="0" w:space="0" w:color="auto"/>
+          <w:left w:val="none" w:sz="0" w:space="0" w:color="auto"/>
+          <w:bottom w:val="none" w:sz="0" w:space="0" w:color="auto"/>
+          <w:right w:val="none" w:sz="0" w:space="0" w:color="auto"/>
+          <w:insideH w:val="none" w:sz="0" w:space="0" w:color="auto"/>
+          <w:insideV w:val="none" w:sz="0" w:space="0" w:color="auto"/>
         </w:tblBorders>
       </w:tblPr>
       <w:tblGrid>
@@ -111,6 +111,12 @@
         <w:tc>
           <w:tcPr>
             <w:tcW w:type="dxa" w:w="5184"/>
+            <w:tcBorders>
+              <w:top w:val="none" w:sz="0" w:space="0" w:color="auto"/>
+              <w:left w:val="none" w:sz="0" w:space="0" w:color="auto"/>
+              <w:bottom w:val="none" w:sz="0" w:space="0" w:color="auto"/>
+              <w:right w:val="none" w:sz="0" w:space="0" w:color="auto"/>
+            </w:tcBorders>
           </w:tcPr>
           <w:p>
             <w:pPr>
@@ -128,6 +134,12 @@
         <w:tc>
           <w:tcPr>
             <w:tcW w:type="dxa" w:w="5184"/>
+            <w:tcBorders>
+              <w:top w:val="none" w:sz="0" w:space="0" w:color="auto"/>
+              <w:left w:val="none" w:sz="0" w:space="0" w:color="auto"/>
+              <w:bottom w:val="none" w:sz="0" w:space="0" w:color="auto"/>
+              <w:right w:val="none" w:sz="0" w:space="0" w:color="auto"/>
+            </w:tcBorders>
           </w:tcPr>
           <w:p>
             <w:pPr>
@@ -227,12 +239,12 @@
         <w:tblLayout w:type="autofit"/>
         <w:tblLook w:firstColumn="1" w:firstRow="1" w:lastColumn="0" w:lastRow="0" w:noHBand="0" w:noVBand="1" w:val="04A0"/>
         <w:tblBorders>
-          <w:top w:val="nil"/>
-          <w:left w:val="nil"/>
-          <w:bottom w:val="nil"/>
-          <w:right w:val="nil"/>
-          <w:insideH w:val="nil"/>
-          <w:insideV w:val="nil"/>
+          <w:top w:val="none" w:sz="0" w:space="0" w:color="auto"/>
+          <w:left w:val="none" w:sz="0" w:space="0" w:color="auto"/>
+          <w:bottom w:val="none" w:sz="0" w:space="0" w:color="auto"/>
+          <w:right w:val="none" w:sz="0" w:space="0" w:color="auto"/>
+          <w:insideH w:val="none" w:sz="0" w:space="0" w:color="auto"/>
+          <w:insideV w:val="none" w:sz="0" w:space="0" w:color="auto"/>
         </w:tblBorders>
       </w:tblPr>
       <w:tblGrid>
@@ -243,6 +255,12 @@
         <w:tc>
           <w:tcPr>
             <w:tcW w:type="dxa" w:w="5184"/>
+            <w:tcBorders>
+              <w:top w:val="none" w:sz="0" w:space="0" w:color="auto"/>
+              <w:left w:val="none" w:sz="0" w:space="0" w:color="auto"/>
+              <w:bottom w:val="none" w:sz="0" w:space="0" w:color="auto"/>
+              <w:right w:val="none" w:sz="0" w:space="0" w:color="auto"/>
+            </w:tcBorders>
           </w:tcPr>
           <w:p>
             <w:pPr>
@@ -260,6 +278,12 @@
         <w:tc>
           <w:tcPr>
             <w:tcW w:type="dxa" w:w="5184"/>
+            <w:tcBorders>
+              <w:top w:val="none" w:sz="0" w:space="0" w:color="auto"/>
+              <w:left w:val="none" w:sz="0" w:space="0" w:color="auto"/>
+              <w:bottom w:val="none" w:sz="0" w:space="0" w:color="auto"/>
+              <w:right w:val="none" w:sz="0" w:space="0" w:color="auto"/>
+            </w:tcBorders>
           </w:tcPr>
           <w:p>
             <w:pPr>
@@ -335,12 +359,12 @@
         <w:tblLayout w:type="autofit"/>
         <w:tblLook w:firstColumn="1" w:firstRow="1" w:lastColumn="0" w:lastRow="0" w:noHBand="0" w:noVBand="1" w:val="04A0"/>
         <w:tblBorders>
-          <w:top w:val="nil"/>
-          <w:left w:val="nil"/>
-          <w:bottom w:val="nil"/>
-          <w:right w:val="nil"/>
-          <w:insideH w:val="nil"/>
-          <w:insideV w:val="nil"/>
+          <w:top w:val="none" w:sz="0" w:space="0" w:color="auto"/>
+          <w:left w:val="none" w:sz="0" w:space="0" w:color="auto"/>
+          <w:bottom w:val="none" w:sz="0" w:space="0" w:color="auto"/>
+          <w:right w:val="none" w:sz="0" w:space="0" w:color="auto"/>
+          <w:insideH w:val="none" w:sz="0" w:space="0" w:color="auto"/>
+          <w:insideV w:val="none" w:sz="0" w:space="0" w:color="auto"/>
         </w:tblBorders>
       </w:tblPr>
       <w:tblGrid>
@@ -351,6 +375,12 @@
         <w:tc>
           <w:tcPr>
             <w:tcW w:type="dxa" w:w="5184"/>
+            <w:tcBorders>
+              <w:top w:val="none" w:sz="0" w:space="0" w:color="auto"/>
+              <w:left w:val="none" w:sz="0" w:space="0" w:color="auto"/>
+              <w:bottom w:val="none" w:sz="0" w:space="0" w:color="auto"/>
+              <w:right w:val="none" w:sz="0" w:space="0" w:color="auto"/>
+            </w:tcBorders>
           </w:tcPr>
           <w:p>
             <w:pPr>
@@ -368,6 +398,12 @@
         <w:tc>
           <w:tcPr>
             <w:tcW w:type="dxa" w:w="5184"/>
+            <w:tcBorders>
+              <w:top w:val="none" w:sz="0" w:space="0" w:color="auto"/>
+              <w:left w:val="none" w:sz="0" w:space="0" w:color="auto"/>
+              <w:bottom w:val="none" w:sz="0" w:space="0" w:color="auto"/>
+              <w:right w:val="none" w:sz="0" w:space="0" w:color="auto"/>
+            </w:tcBorders>
           </w:tcPr>
           <w:p>
             <w:pPr>
@@ -556,12 +592,12 @@
         <w:tblLayout w:type="autofit"/>
         <w:tblLook w:firstColumn="1" w:firstRow="1" w:lastColumn="0" w:lastRow="0" w:noHBand="0" w:noVBand="1" w:val="04A0"/>
         <w:tblBorders>
-          <w:top w:val="nil"/>
-          <w:left w:val="nil"/>
-          <w:bottom w:val="nil"/>
-          <w:right w:val="nil"/>
-          <w:insideH w:val="nil"/>
-          <w:insideV w:val="nil"/>
+          <w:top w:val="none" w:sz="0" w:space="0" w:color="auto"/>
+          <w:left w:val="none" w:sz="0" w:space="0" w:color="auto"/>
+          <w:bottom w:val="none" w:sz="0" w:space="0" w:color="auto"/>
+          <w:right w:val="none" w:sz="0" w:space="0" w:color="auto"/>
+          <w:insideH w:val="none" w:sz="0" w:space="0" w:color="auto"/>
+          <w:insideV w:val="none" w:sz="0" w:space="0" w:color="auto"/>
         </w:tblBorders>
       </w:tblPr>
       <w:tblGrid>
@@ -572,6 +608,12 @@
         <w:tc>
           <w:tcPr>
             <w:tcW w:type="dxa" w:w="5184"/>
+            <w:tcBorders>
+              <w:top w:val="none" w:sz="0" w:space="0" w:color="auto"/>
+              <w:left w:val="none" w:sz="0" w:space="0" w:color="auto"/>
+              <w:bottom w:val="none" w:sz="0" w:space="0" w:color="auto"/>
+              <w:right w:val="none" w:sz="0" w:space="0" w:color="auto"/>
+            </w:tcBorders>
           </w:tcPr>
           <w:p>
             <w:pPr>
@@ -589,6 +631,12 @@
         <w:tc>
           <w:tcPr>
             <w:tcW w:type="dxa" w:w="5184"/>
+            <w:tcBorders>
+              <w:top w:val="none" w:sz="0" w:space="0" w:color="auto"/>
+              <w:left w:val="none" w:sz="0" w:space="0" w:color="auto"/>
+              <w:bottom w:val="none" w:sz="0" w:space="0" w:color="auto"/>
+              <w:right w:val="none" w:sz="0" w:space="0" w:color="auto"/>
+            </w:tcBorders>
           </w:tcPr>
           <w:p>
             <w:pPr>

</xml_diff>